<commit_message>
Integrate fce file-extraction capabilities into adapters
将历史工具 fce 的核心能力拆解融入 adapters（fce/ 原样保留作参照）：

- adapters/tables.py: 统一表格契约（TableCell/TableRow/ExtractedTable，
  rowspan/colspan/bbox/置信度/跨页续表）与 ArtifactBlock 元数据转换
- adapters/pdf_tables.py: PDF 矢量线表格引擎（连通分量、union-find 合并
  单元格、表头识别、重复表头面板拆分、跨页续表链接）；几何采集层改用
  pdfplumber 原语，算法保真移植自 fce/pdf_tables.py
- adapters/ocr/: OCR 子包（PaddleOCR 懒加载、超大图分片、破折号/英文
  间距/列表符号后处理、SLANet 表格结构识别）；默认关闭，模型仅从本地
  目录解析（沿用 fce/AGENTS.md 边界约束）
- adapters/text.py: 纯文本适配器（多编码回退 utf-8/gb18030/utf-16）
- adapters/xls.py: .xls 适配器（xlrd → Excel/WPS COM 回退，懒加载）
- adapters/doc_legacy.py: .doc 适配器（Word/WPS COM，懒加载）
- adapters/docx.py: 嵌套表格提取 + 合并单元格 span 识别（tc 同一性）
- adapters/textnorm.py: 文本/单元格规范化（fce 移植）
- adapters/pdf.py: 重写为矢量表格优先 + pdfplumber 回退 + OCR 可选路径
- workspace/services/llm: 新格式路由、OcrOptions 透传、续表 Context 标注
- fixtures 增至 8 个（跨页表格 PDF、.xls）；测试 83 → 120 项
- evals/baseline-phase1-v0.2.json 记录融入后 baseline
</commit_message>
<xml_diff>
--- a/evals/fixtures/complex.docx
+++ b/evals/fixtures/complex.docx
@@ -216,27 +216,29 @@
         <w:tblLook w:firstColumn="1" w:firstRow="1" w:lastColumn="0" w:lastRow="0" w:noHBand="0" w:noVBand="1" w:val="04A0"/>
       </w:tblPr>
       <w:tblGrid>
-        <w:gridCol w:w="4320"/>
-        <w:gridCol w:w="4320"/>
+        <w:gridCol w:w="2880"/>
+        <w:gridCol w:w="2880"/>
+        <w:gridCol w:w="2880"/>
       </w:tblGrid>
       <w:tr>
         <w:tc>
           <w:tcPr>
-            <w:tcW w:type="dxa" w:w="4320"/>
+            <w:tcW w:type="dxa" w:w="5760"/>
+            <w:gridSpan w:val="2"/>
           </w:tcPr>
           <w:p>
             <w:r>
-              <w:t>风险</w:t>
+              <w:t>风险类别</w:t>
             </w:r>
           </w:p>
         </w:tc>
         <w:tc>
           <w:tcPr>
-            <w:tcW w:type="dxa" w:w="4320"/>
+            <w:tcW w:type="dxa" w:w="2880"/>
           </w:tcPr>
           <w:p>
             <w:r>
-              <w:t>对策</w:t>
+              <w:t>应对策略</w:t>
             </w:r>
           </w:p>
         </w:tc>
@@ -244,7 +246,7 @@
       <w:tr>
         <w:tc>
           <w:tcPr>
-            <w:tcW w:type="dxa" w:w="4320"/>
+            <w:tcW w:type="dxa" w:w="2880"/>
           </w:tcPr>
           <w:p>
             <w:r>
@@ -254,7 +256,17 @@
         </w:tc>
         <w:tc>
           <w:tcPr>
-            <w:tcW w:type="dxa" w:w="4320"/>
+            <w:tcW w:type="dxa" w:w="2880"/>
+          </w:tcPr>
+          <w:p>
+            <w:r>
+              <w:t>无文本层</w:t>
+            </w:r>
+          </w:p>
+        </w:tc>
+        <w:tc>
+          <w:tcPr>
+            <w:tcW w:type="dxa" w:w="2880"/>
           </w:tcPr>
           <w:p>
             <w:r>
@@ -266,7 +278,7 @@
       <w:tr>
         <w:tc>
           <w:tcPr>
-            <w:tcW w:type="dxa" w:w="4320"/>
+            <w:tcW w:type="dxa" w:w="2880"/>
           </w:tcPr>
           <w:p>
             <w:r>
@@ -276,13 +288,109 @@
         </w:tc>
         <w:tc>
           <w:tcPr>
-            <w:tcW w:type="dxa" w:w="4320"/>
+            <w:tcW w:type="dxa" w:w="2880"/>
+          </w:tcPr>
+          <w:p>
+            <w:r>
+              <w:t>渲染溢出</w:t>
+            </w:r>
+          </w:p>
+        </w:tc>
+        <w:tc>
+          <w:tcPr>
+            <w:tcW w:type="dxa" w:w="2880"/>
           </w:tcPr>
           <w:p>
             <w:r>
               <w:t>截断并标注</w:t>
             </w:r>
           </w:p>
+        </w:tc>
+      </w:tr>
+    </w:tbl>
+    <w:p>
+      <w:pPr>
+        <w:pStyle w:val="Heading1"/>
+      </w:pPr>
+      <w:r>
+        <w:t>五、嵌套结构示例</w:t>
+      </w:r>
+    </w:p>
+    <w:tbl>
+      <w:tblPr>
+        <w:tblStyle w:val="TableGrid"/>
+        <w:tblW w:type="auto" w:w="0"/>
+        <w:tblLook w:firstColumn="1" w:firstRow="1" w:lastColumn="0" w:lastRow="0" w:noHBand="0" w:noVBand="1" w:val="04A0"/>
+      </w:tblPr>
+      <w:tblGrid>
+        <w:gridCol w:w="8640"/>
+      </w:tblGrid>
+      <w:tr>
+        <w:tc>
+          <w:tcPr>
+            <w:tcW w:type="dxa" w:w="8640"/>
+          </w:tcPr>
+          <w:p>
+            <w:r>
+              <w:t>以下为部门联系人嵌套表格：</w:t>
+            </w:r>
+          </w:p>
+          <w:tbl>
+            <w:tblPr>
+              <w:tblStyle w:val="TableGrid"/>
+              <w:tblW w:type="auto" w:w="0"/>
+              <w:tblLook w:firstColumn="1" w:firstRow="1" w:lastColumn="0" w:lastRow="0" w:noHBand="0" w:noVBand="1" w:val="04A0"/>
+            </w:tblPr>
+            <w:tblGrid>
+              <w:gridCol w:w="4320"/>
+              <w:gridCol w:w="4320"/>
+            </w:tblGrid>
+            <w:tr>
+              <w:tc>
+                <w:tcPr>
+                  <w:tcW w:type="dxa" w:w="4320"/>
+                </w:tcPr>
+                <w:p>
+                  <w:r>
+                    <w:t>姓名</w:t>
+                  </w:r>
+                </w:p>
+              </w:tc>
+              <w:tc>
+                <w:tcPr>
+                  <w:tcW w:type="dxa" w:w="4320"/>
+                </w:tcPr>
+                <w:p>
+                  <w:r>
+                    <w:t>电话</w:t>
+                  </w:r>
+                </w:p>
+              </w:tc>
+            </w:tr>
+            <w:tr>
+              <w:tc>
+                <w:tcPr>
+                  <w:tcW w:type="dxa" w:w="4320"/>
+                </w:tcPr>
+                <w:p>
+                  <w:r>
+                    <w:t>张伟</w:t>
+                  </w:r>
+                </w:p>
+              </w:tc>
+              <w:tc>
+                <w:tcPr>
+                  <w:tcW w:type="dxa" w:w="4320"/>
+                </w:tcPr>
+                <w:p>
+                  <w:r>
+                    <w:t>13800000000</w:t>
+                  </w:r>
+                </w:p>
+              </w:tc>
+            </w:tr>
+          </w:tbl>
+          <w:p/>
         </w:tc>
       </w:tr>
     </w:tbl>

</xml_diff>